<commit_message>
Embed database tables into SRS docx; add runnable schema.sql
The DB deliverable is now inside the Word document, not a placeholder:
- schema.sql: one-shot DDL + seed + verify queries (phpMyAdmin Import /
  Workbench Run / mysql CLI).
- gen_db_tables.py: renders all 5 tables (users, tickets, comments,
  ticket_activities, notifications) as Browse-style grids from the seed,
  identical to the app dummy data.
- SRS docx new section 6.3 embeds those 5 tables (now 10 figures total).

Remaining placeholders kept only where this environment cannot produce
honest captures: app screenshots (no emulator/adb) and Postman/Swagger
(no running backend).
</commit_message>
<xml_diff>
--- a/UAS SRS MOBILE PRAKTIKUM.docx
+++ b/UAS SRS MOBILE PRAKTIKUM.docx
@@ -3219,27 +3219,298 @@
           <w:color w:val="555555"/>
           <w:sz w:val="20"/>
         </w:rPr>
-        <w:t>DDL CREATE TABLE, penjelasan kolom, dan seed data lengkap tersedia pada docs/DATABASE_DOCUMENTATION.md.</w:t>
+        <w:t>DDL CREATE TABLE, penjelasan kolom, dan seed data lengkap tersedia pada docs/DATABASE_DOCUMENTATION.md, serta file siap-jalan docs/schema.sql.</w:t>
       </w:r>
     </w:p>
     <w:p>
       <w:pPr>
-        <w:spacing w:before="80" w:after="200"/>
-        <w:shd w:val="clear" w:fill="F0F4F8"/>
-        <w:pBdr>
-          <w:top w:val="single" w:sz="6" w:space="6" w:color="9DB4C8"/>
-          <w:left w:val="single" w:sz="6" w:space="6" w:color="9DB4C8"/>
-          <w:bottom w:val="single" w:sz="6" w:space="6" w:color="9DB4C8"/>
-          <w:right w:val="single" w:sz="6" w:space="6" w:color="9DB4C8"/>
-        </w:pBdr>
+        <w:pStyle w:val="Heading2"/>
+      </w:pPr>
+      <w:r>
+        <w:t>6.3. Tabel Database (Seed Data)</w:t>
+      </w:r>
+    </w:p>
+    <w:p>
+      <w:pPr>
+        <w:spacing w:after="120"/>
       </w:pPr>
       <w:r>
         <w:rPr>
+          <w:b w:val="0"/>
+          <w:i w:val="0"/>
+          <w:sz w:val="22"/>
+        </w:rPr>
+        <w:t>Isi tiap tabel basis data sesuai seed pada docs/schema.sql (identik dengan data dummy aplikasi). Dihasilkan langsung dari skema; setara tampilan Browse phpMyAdmin / MySQL Workbench.</w:t>
+      </w:r>
+    </w:p>
+    <w:p>
+      <w:pPr>
+        <w:jc w:val="center"/>
+      </w:pPr>
+      <w:r>
+        <w:drawing>
+          <wp:inline xmlns:a="http://schemas.openxmlformats.org/drawingml/2006/main" xmlns:pic="http://schemas.openxmlformats.org/drawingml/2006/picture">
+            <wp:extent cx="5120640" cy="2311995"/>
+            <wp:docPr id="6" name="Picture 6"/>
+            <wp:cNvGraphicFramePr>
+              <a:graphicFrameLocks noChangeAspect="1"/>
+            </wp:cNvGraphicFramePr>
+            <a:graphic>
+              <a:graphicData uri="http://schemas.openxmlformats.org/drawingml/2006/picture">
+                <pic:pic>
+                  <pic:nvPicPr>
+                    <pic:cNvPr id="0" name="db_users.png"/>
+                    <pic:cNvPicPr/>
+                  </pic:nvPicPr>
+                  <pic:blipFill>
+                    <a:blip r:embed="rId13"/>
+                    <a:stretch>
+                      <a:fillRect/>
+                    </a:stretch>
+                  </pic:blipFill>
+                  <pic:spPr>
+                    <a:xfrm>
+                      <a:off x="0" y="0"/>
+                      <a:ext cx="5120640" cy="2311995"/>
+                    </a:xfrm>
+                    <a:prstGeom prst="rect"/>
+                  </pic:spPr>
+                </pic:pic>
+              </a:graphicData>
+            </a:graphic>
+          </wp:inline>
+        </w:drawing>
+      </w:r>
+    </w:p>
+    <w:p>
+      <w:pPr>
+        <w:spacing w:after="240"/>
+        <w:jc w:val="center"/>
+      </w:pPr>
+      <w:r>
+        <w:rPr>
+          <w:b w:val="0"/>
           <w:i/>
           <w:color w:val="555555"/>
-          <w:sz w:val="20"/>
+          <w:sz w:val="18"/>
         </w:rPr>
-        <w:t>📷  Screenshot: tabel database (Structure &amp; Browse) dari phpMyAdmin / MySQL Workbench</w:t>
+        <w:t>Gambar 6. Tabel users</w:t>
+      </w:r>
+    </w:p>
+    <w:p>
+      <w:pPr>
+        <w:jc w:val="center"/>
+      </w:pPr>
+      <w:r>
+        <w:drawing>
+          <wp:inline xmlns:a="http://schemas.openxmlformats.org/drawingml/2006/main" xmlns:pic="http://schemas.openxmlformats.org/drawingml/2006/picture">
+            <wp:extent cx="5852160" cy="967299"/>
+            <wp:docPr id="7" name="Picture 7"/>
+            <wp:cNvGraphicFramePr>
+              <a:graphicFrameLocks noChangeAspect="1"/>
+            </wp:cNvGraphicFramePr>
+            <a:graphic>
+              <a:graphicData uri="http://schemas.openxmlformats.org/drawingml/2006/picture">
+                <pic:pic>
+                  <pic:nvPicPr>
+                    <pic:cNvPr id="0" name="db_tickets.png"/>
+                    <pic:cNvPicPr/>
+                  </pic:nvPicPr>
+                  <pic:blipFill>
+                    <a:blip r:embed="rId14"/>
+                    <a:stretch>
+                      <a:fillRect/>
+                    </a:stretch>
+                  </pic:blipFill>
+                  <pic:spPr>
+                    <a:xfrm>
+                      <a:off x="0" y="0"/>
+                      <a:ext cx="5852160" cy="967299"/>
+                    </a:xfrm>
+                    <a:prstGeom prst="rect"/>
+                  </pic:spPr>
+                </pic:pic>
+              </a:graphicData>
+            </a:graphic>
+          </wp:inline>
+        </w:drawing>
+      </w:r>
+    </w:p>
+    <w:p>
+      <w:pPr>
+        <w:spacing w:after="240"/>
+        <w:jc w:val="center"/>
+      </w:pPr>
+      <w:r>
+        <w:rPr>
+          <w:b w:val="0"/>
+          <w:i/>
+          <w:color w:val="555555"/>
+          <w:sz w:val="18"/>
+        </w:rPr>
+        <w:t>Gambar 7. Tabel tickets</w:t>
+      </w:r>
+    </w:p>
+    <w:p>
+      <w:pPr>
+        <w:jc w:val="center"/>
+      </w:pPr>
+      <w:r>
+        <w:drawing>
+          <wp:inline xmlns:a="http://schemas.openxmlformats.org/drawingml/2006/main" xmlns:pic="http://schemas.openxmlformats.org/drawingml/2006/picture">
+            <wp:extent cx="5486400" cy="1097280"/>
+            <wp:docPr id="8" name="Picture 8"/>
+            <wp:cNvGraphicFramePr>
+              <a:graphicFrameLocks noChangeAspect="1"/>
+            </wp:cNvGraphicFramePr>
+            <a:graphic>
+              <a:graphicData uri="http://schemas.openxmlformats.org/drawingml/2006/picture">
+                <pic:pic>
+                  <pic:nvPicPr>
+                    <pic:cNvPr id="0" name="db_comments.png"/>
+                    <pic:cNvPicPr/>
+                  </pic:nvPicPr>
+                  <pic:blipFill>
+                    <a:blip r:embed="rId15"/>
+                    <a:stretch>
+                      <a:fillRect/>
+                    </a:stretch>
+                  </pic:blipFill>
+                  <pic:spPr>
+                    <a:xfrm>
+                      <a:off x="0" y="0"/>
+                      <a:ext cx="5486400" cy="1097280"/>
+                    </a:xfrm>
+                    <a:prstGeom prst="rect"/>
+                  </pic:spPr>
+                </pic:pic>
+              </a:graphicData>
+            </a:graphic>
+          </wp:inline>
+        </w:drawing>
+      </w:r>
+    </w:p>
+    <w:p>
+      <w:pPr>
+        <w:spacing w:after="240"/>
+        <w:jc w:val="center"/>
+      </w:pPr>
+      <w:r>
+        <w:rPr>
+          <w:b w:val="0"/>
+          <w:i/>
+          <w:color w:val="555555"/>
+          <w:sz w:val="18"/>
+        </w:rPr>
+        <w:t>Gambar 8. Tabel comments</w:t>
+      </w:r>
+    </w:p>
+    <w:p>
+      <w:pPr>
+        <w:jc w:val="center"/>
+      </w:pPr>
+      <w:r>
+        <w:drawing>
+          <wp:inline xmlns:a="http://schemas.openxmlformats.org/drawingml/2006/main" xmlns:pic="http://schemas.openxmlformats.org/drawingml/2006/picture">
+            <wp:extent cx="5303520" cy="2194560"/>
+            <wp:docPr id="9" name="Picture 9"/>
+            <wp:cNvGraphicFramePr>
+              <a:graphicFrameLocks noChangeAspect="1"/>
+            </wp:cNvGraphicFramePr>
+            <a:graphic>
+              <a:graphicData uri="http://schemas.openxmlformats.org/drawingml/2006/picture">
+                <pic:pic>
+                  <pic:nvPicPr>
+                    <pic:cNvPr id="0" name="db_activities.png"/>
+                    <pic:cNvPicPr/>
+                  </pic:nvPicPr>
+                  <pic:blipFill>
+                    <a:blip r:embed="rId16"/>
+                    <a:stretch>
+                      <a:fillRect/>
+                    </a:stretch>
+                  </pic:blipFill>
+                  <pic:spPr>
+                    <a:xfrm>
+                      <a:off x="0" y="0"/>
+                      <a:ext cx="5303520" cy="2194560"/>
+                    </a:xfrm>
+                    <a:prstGeom prst="rect"/>
+                  </pic:spPr>
+                </pic:pic>
+              </a:graphicData>
+            </a:graphic>
+          </wp:inline>
+        </w:drawing>
+      </w:r>
+    </w:p>
+    <w:p>
+      <w:pPr>
+        <w:spacing w:after="240"/>
+        <w:jc w:val="center"/>
+      </w:pPr>
+      <w:r>
+        <w:rPr>
+          <w:b w:val="0"/>
+          <w:i/>
+          <w:color w:val="555555"/>
+          <w:sz w:val="18"/>
+        </w:rPr>
+        <w:t>Gambar 9. Tabel ticket_activities</w:t>
+      </w:r>
+    </w:p>
+    <w:p>
+      <w:pPr>
+        <w:jc w:val="center"/>
+      </w:pPr>
+      <w:r>
+        <w:drawing>
+          <wp:inline xmlns:a="http://schemas.openxmlformats.org/drawingml/2006/main" xmlns:pic="http://schemas.openxmlformats.org/drawingml/2006/picture">
+            <wp:extent cx="5486400" cy="1077173"/>
+            <wp:docPr id="10" name="Picture 10"/>
+            <wp:cNvGraphicFramePr>
+              <a:graphicFrameLocks noChangeAspect="1"/>
+            </wp:cNvGraphicFramePr>
+            <a:graphic>
+              <a:graphicData uri="http://schemas.openxmlformats.org/drawingml/2006/picture">
+                <pic:pic>
+                  <pic:nvPicPr>
+                    <pic:cNvPr id="0" name="db_notifications.png"/>
+                    <pic:cNvPicPr/>
+                  </pic:nvPicPr>
+                  <pic:blipFill>
+                    <a:blip r:embed="rId17"/>
+                    <a:stretch>
+                      <a:fillRect/>
+                    </a:stretch>
+                  </pic:blipFill>
+                  <pic:spPr>
+                    <a:xfrm>
+                      <a:off x="0" y="0"/>
+                      <a:ext cx="5486400" cy="1077173"/>
+                    </a:xfrm>
+                    <a:prstGeom prst="rect"/>
+                  </pic:spPr>
+                </pic:pic>
+              </a:graphicData>
+            </a:graphic>
+          </wp:inline>
+        </w:drawing>
+      </w:r>
+    </w:p>
+    <w:p>
+      <w:pPr>
+        <w:spacing w:after="240"/>
+        <w:jc w:val="center"/>
+      </w:pPr>
+      <w:r>
+        <w:rPr>
+          <w:b w:val="0"/>
+          <w:i/>
+          <w:color w:val="555555"/>
+          <w:sz w:val="18"/>
+        </w:rPr>
+        <w:t>Gambar 10. Tabel notifications</w:t>
       </w:r>
     </w:p>
     <w:p>

</xml_diff>

<commit_message>
Clean up repository: remove log files, analysis reports, and video tutorial script, and regenerate SRS docx
</commit_message>
<xml_diff>
--- a/UAS SRS MOBILE PRAKTIKUM.docx
+++ b/UAS SRS MOBILE PRAKTIKUM.docx
@@ -4172,36 +4172,6 @@
           </w:p>
         </w:tc>
       </w:tr>
-      <w:tr>
-        <w:tc>
-          <w:tcPr>
-            <w:tcW w:type="dxa" w:w="3744"/>
-          </w:tcPr>
-          <w:p>
-            <w:r/>
-            <w:r>
-              <w:rPr>
-                <w:sz w:val="20"/>
-              </w:rPr>
-              <w:t>docs/VIDEO_TUTORIAL_SCRIPT.md</w:t>
-            </w:r>
-          </w:p>
-        </w:tc>
-        <w:tc>
-          <w:tcPr>
-            <w:tcW w:type="dxa" w:w="4896"/>
-          </w:tcPr>
-          <w:p>
-            <w:r/>
-            <w:r>
-              <w:rPr>
-                <w:sz w:val="20"/>
-              </w:rPr>
-              <w:t>Naskah/storyboard video tutorial</w:t>
-            </w:r>
-          </w:p>
-        </w:tc>
-      </w:tr>
     </w:tbl>
     <w:p>
       <w:pPr>

</xml_diff>